<commit_message>
entrega: banco de 16/10 com o SIG de 14 a 16/10
Mesma base da rede (13/10 + extratos ate 15/10) e RH de 16/10, agora com
os 3 SIG que estavam na ENTRADA (14, 15 e 16/10, Arquivos_origem/16102026/
10-2026.zip). Codigo f64e1fd. Diferencas para o banco anterior so' no SIG
(80092 -> 76181 acessos). Checklist 16/16, integrity ok, 5,8 min local.
Roteiro: mover os 3 SIG para PROCESSADOS na rede.

Co-Authored-By: Claude Opus 5.5 <noreply@anthropic.com>
</commit_message>
<xml_diff>
--- a/ENTREGA/ROTEIRO_AJUSTES_CVC_IAM_2026-10-16.docx
+++ b/ENTREGA/ROTEIRO_AJUSTES_CVC_IAM_2026-10-16.docx
@@ -166,7 +166,7 @@
           <w:color w:val="2C3340"/>
           <w:sz w:val="20"/>
         </w:rPr>
-        <w:t>O banco já vem processado (BANCO_PROCESSADO_2026-10-16.zip): base da rede de 13/10 com os extratos até 15/10, mais o RH de 16/10, com as regras novas. O processamento da rede de 15/10 (iniciado às 17:17) não terminou e deixou um journal aberto; este banco o substitui. A versão dos executáveis continua 1.0.3: nenhuma máquina se atualiza sozinha.</w:t>
+        <w:t>O banco já vem processado (BANCO_PROCESSADO_2026-10-16.zip): base da rede de 13/10 com os extratos até 15/10, mais o RH e o SIG de 14 a 16/10, com as regras novas. O processamento da rede de 15/10 (iniciado às 17:17) não terminou e deixou um journal aberto; este banco o substitui. A versão dos executáveis continua 1.0.3: nenhuma máquina se atualiza sozinha.</w:t>
       </w:r>
     </w:p>
     <w:p>
@@ -214,7 +214,7 @@
           <w:color w:val="2C3340"/>
           <w:sz w:val="19"/>
         </w:rPr>
-        <w:t>Não mexa na pasta INTERACOES nem na ENTRADA (os 2 arquivos de SIG de 14 e 15/10 continuam lá e entram no próximo processamento).</w:t>
+        <w:t>Não mexa na pasta INTERACOES. Em ENTRADA\SISTEMAS\SIG\10-2026, mova os 3 arquivos view_sig_14_10, view_sig_15_10 e view_sig_16_10 para a subpasta PROCESSADOS: eles já estão no banco novo (se ficarem, o próximo processamento os importa de novo, à toa).</w:t>
       </w:r>
     </w:p>
     <w:p>

</xml_diff>